<commit_message>
report on the 2026 template
new chapter 4 with requirements, use cases and an er diagram, chapters 5 to 7 moved around to match, tables and figures numbered by chapter, times new roman 12 at 1.5. degree line on the title page still needs filling in.
</commit_message>
<xml_diff>
--- a/docs/deliverables/ConferenceCheck Validation Report.docx
+++ b/docs/deliverables/ConferenceCheck Validation Report.docx
@@ -8749,8 +8749,8 @@
       <w:tblGrid>
         <w:gridCol w:w="780"/>
         <w:gridCol w:w="1300"/>
-        <w:gridCol w:w="3242"/>
-        <w:gridCol w:w="4038"/>
+        <w:gridCol w:w="3224"/>
+        <w:gridCol w:w="4056"/>
       </w:tblGrid>
       <w:tr>
         <w:trPr>
@@ -8786,7 +8786,7 @@
         </w:tc>
         <w:tc>
           <w:tcPr>
-            <w:tcW w:type="dxa" w:w="3242"/>
+            <w:tcW w:type="dxa" w:w="3224"/>
           </w:tcPr>
           <w:p>
             <w:pPr>
@@ -8800,7 +8800,7 @@
         </w:tc>
         <w:tc>
           <w:tcPr>
-            <w:tcW w:type="dxa" w:w="4038"/>
+            <w:tcW w:type="dxa" w:w="4056"/>
           </w:tcPr>
           <w:p>
             <w:pPr>
@@ -8844,7 +8844,7 @@
         </w:tc>
         <w:tc>
           <w:tcPr>
-            <w:tcW w:type="dxa" w:w="3242"/>
+            <w:tcW w:type="dxa" w:w="3224"/>
           </w:tcPr>
           <w:p>
             <w:pPr>
@@ -8858,15 +8858,15 @@
         </w:tc>
         <w:tc>
           <w:tcPr>
-            <w:tcW w:type="dxa" w:w="4038"/>
-          </w:tcPr>
-          <w:p>
-            <w:pPr>
-              <w:pStyle w:val="Compact"/>
-              <w:jc w:val="left"/>
-            </w:pPr>
-            <w:r>
-              <w:t xml:space="preserve">Supper shown Unused with a QR code; Lunch and Breakfast shown Redeemed with their times (report Figure 7)</w:t>
+            <w:tcW w:type="dxa" w:w="4056"/>
+          </w:tcPr>
+          <w:p>
+            <w:pPr>
+              <w:pStyle w:val="Compact"/>
+              <w:jc w:val="left"/>
+            </w:pPr>
+            <w:r>
+              <w:t xml:space="preserve">Supper shown Unused with a QR code; Lunch and Breakfast shown Redeemed with their times (report Figure E6)</w:t>
             </w:r>
           </w:p>
         </w:tc>
@@ -8902,7 +8902,7 @@
         </w:tc>
         <w:tc>
           <w:tcPr>
-            <w:tcW w:type="dxa" w:w="3242"/>
+            <w:tcW w:type="dxa" w:w="3224"/>
           </w:tcPr>
           <w:p>
             <w:pPr>
@@ -8931,15 +8931,15 @@
         </w:tc>
         <w:tc>
           <w:tcPr>
-            <w:tcW w:type="dxa" w:w="4038"/>
-          </w:tcPr>
-          <w:p>
-            <w:pPr>
-              <w:pStyle w:val="Compact"/>
-              <w:jc w:val="left"/>
-            </w:pPr>
-            <w:r>
-              <w:t xml:space="preserve">200, "Voucher redeemed successfully." (report Figure 9); voucher</w:t>
+            <w:tcW w:type="dxa" w:w="4056"/>
+          </w:tcPr>
+          <w:p>
+            <w:pPr>
+              <w:pStyle w:val="Compact"/>
+              <w:jc w:val="left"/>
+            </w:pPr>
+            <w:r>
+              <w:t xml:space="preserve">200, "Voucher redeemed successfully." (report Figure E8); voucher</w:t>
             </w:r>
             <w:r>
               <w:t xml:space="preserve"> </w:t>
@@ -9002,7 +9002,7 @@
         </w:tc>
         <w:tc>
           <w:tcPr>
-            <w:tcW w:type="dxa" w:w="3242"/>
+            <w:tcW w:type="dxa" w:w="3224"/>
           </w:tcPr>
           <w:p>
             <w:pPr>
@@ -9016,7 +9016,7 @@
         </w:tc>
         <w:tc>
           <w:tcPr>
-            <w:tcW w:type="dxa" w:w="4038"/>
+            <w:tcW w:type="dxa" w:w="4056"/>
           </w:tcPr>
           <w:p>
             <w:pPr>
@@ -9060,7 +9060,7 @@
         </w:tc>
         <w:tc>
           <w:tcPr>
-            <w:tcW w:type="dxa" w:w="3242"/>
+            <w:tcW w:type="dxa" w:w="3224"/>
           </w:tcPr>
           <w:p>
             <w:pPr>
@@ -9074,15 +9074,15 @@
         </w:tc>
         <w:tc>
           <w:tcPr>
-            <w:tcW w:type="dxa" w:w="4038"/>
-          </w:tcPr>
-          <w:p>
-            <w:pPr>
-              <w:pStyle w:val="Compact"/>
-              <w:jc w:val="left"/>
-            </w:pPr>
-            <w:r>
-              <w:t xml:space="preserve">409, "Meal voucher has already been redeemed or is not usable." (report Figure 10)</w:t>
+            <w:tcW w:type="dxa" w:w="4056"/>
+          </w:tcPr>
+          <w:p>
+            <w:pPr>
+              <w:pStyle w:val="Compact"/>
+              <w:jc w:val="left"/>
+            </w:pPr>
+            <w:r>
+              <w:t xml:space="preserve">409, "Meal voucher has already been redeemed or is not usable." (report Figure E9)</w:t>
             </w:r>
           </w:p>
         </w:tc>
@@ -9118,7 +9118,7 @@
         </w:tc>
         <w:tc>
           <w:tcPr>
-            <w:tcW w:type="dxa" w:w="3242"/>
+            <w:tcW w:type="dxa" w:w="3224"/>
           </w:tcPr>
           <w:p>
             <w:pPr>
@@ -9132,7 +9132,7 @@
         </w:tc>
         <w:tc>
           <w:tcPr>
-            <w:tcW w:type="dxa" w:w="4038"/>
+            <w:tcW w:type="dxa" w:w="4056"/>
           </w:tcPr>
           <w:p>
             <w:pPr>
@@ -9197,7 +9197,7 @@
         </w:tc>
         <w:tc>
           <w:tcPr>
-            <w:tcW w:type="dxa" w:w="3242"/>
+            <w:tcW w:type="dxa" w:w="3224"/>
           </w:tcPr>
           <w:p>
             <w:pPr>
@@ -9220,7 +9220,7 @@
         </w:tc>
         <w:tc>
           <w:tcPr>
-            <w:tcW w:type="dxa" w:w="4038"/>
+            <w:tcW w:type="dxa" w:w="4056"/>
           </w:tcPr>
           <w:p>
             <w:pPr>

</xml_diff>